<commit_message>
docs: cập nhật link commits trong báo cáo tuần 1
</commit_message>
<xml_diff>
--- a/reports/Bao_cao_tuan1_Nhom_DevOps_IaC.docx
+++ b/reports/Bao_cao_tuan1_Nhom_DevOps_IaC.docx
@@ -305,6 +305,7 @@
           <w:rFonts w:ascii="Times New Roman" w:hAnsi="Times New Roman" w:cs="Times New Roman"/>
           <w:sz w:val="26"/>
           <w:szCs w:val="26"/>
+          <w:u w:val="single"/>
         </w:rPr>
       </w:pPr>
       <w:r>
@@ -334,34 +335,10 @@
           <w:rPr>
             <w:rStyle w:val="Hyperlink"/>
             <w:rFonts w:ascii="Times New Roman" w:hAnsi="Times New Roman" w:cs="Times New Roman"/>
-            <w:b/>
-            <w:bCs/>
             <w:sz w:val="26"/>
             <w:szCs w:val="26"/>
           </w:rPr>
-          <w:t>Commits · nguyentrung01</w:t>
-        </w:r>
-        <w:r>
-          <w:rPr>
-            <w:rStyle w:val="Hyperlink"/>
-            <w:rFonts w:ascii="Times New Roman" w:hAnsi="Times New Roman" w:cs="Times New Roman"/>
-            <w:b/>
-            <w:bCs/>
-            <w:sz w:val="26"/>
-            <w:szCs w:val="26"/>
-          </w:rPr>
-          <w:t>u</w:t>
-        </w:r>
-        <w:r>
-          <w:rPr>
-            <w:rStyle w:val="Hyperlink"/>
-            <w:rFonts w:ascii="Times New Roman" w:hAnsi="Times New Roman" w:cs="Times New Roman"/>
-            <w:b/>
-            <w:bCs/>
-            <w:sz w:val="26"/>
-            <w:szCs w:val="26"/>
-          </w:rPr>
-          <w:t>te-ui/autoschedule</w:t>
+          <w:t>https://github.com/nguyentrung01ute-ui/autoschedule/commits/main</w:t>
         </w:r>
       </w:hyperlink>
     </w:p>

</xml_diff>

<commit_message>
docs(report): cập nhật link mã nguồn, bảng khai báo AI và commit minh chứng tuần 1
</commit_message>
<xml_diff>
--- a/reports/Bao_cao_tuan1_Nhom_DevOps_IaC.docx
+++ b/reports/Bao_cao_tuan1_Nhom_DevOps_IaC.docx
@@ -309,27 +309,16 @@
         </w:rPr>
       </w:pPr>
       <w:r>
-        <w:rPr>
-          <w:rFonts w:ascii="Times New Roman" w:hAnsi="Times New Roman" w:cs="Times New Roman"/>
-          <w:b/>
-          <w:bCs/>
-          <w:color w:val="EE0000"/>
-          <w:sz w:val="26"/>
-          <w:szCs w:val="26"/>
-        </w:rPr>
-        <w:t xml:space="preserve">Link commits: </w:t>
-      </w:r>
-      <w:hyperlink r:id="rId7" w:history="1">
-        <w:r>
-          <w:rPr>
-            <w:rStyle w:val="Hyperlink"/>
-            <w:rFonts w:ascii="Times New Roman" w:hAnsi="Times New Roman" w:cs="Times New Roman"/>
-            <w:sz w:val="26"/>
-            <w:szCs w:val="26"/>
-          </w:rPr>
-          <w:t>https://github.com/nguyentrung01ute-ui/autoschedule/commits/main/</w:t>
-        </w:r>
-      </w:hyperlink>
+        <w:t>Link commits: https://github.com/nguyentrung01ute-ui/autoschedule/commits/main/</w:t>
+        <w:br/>
+        <w:t>Link mã nguồn Lambda (Python): https://github.com/nguyentrung01ute-ui/autoschedule/blob/main/src/scheduler.py</w:t>
+        <w:br/>
+        <w:t>Link CloudFormation template (IaC): https://github.com/nguyentrung01ute-ui/autoschedule/blob/main/infra/template.yaml</w:t>
+        <w:br/>
+        <w:t>Link Unit test (pytest): https://github.com/nguyentrung01ute-ui/autoschedule/blob/main/tests/test_schedule.py</w:t>
+        <w:br/>
+        <w:t>Link Scripts hạ tầng: https://github.com/nguyentrung01ute-ui/autoschedule/tree/main/scripts</w:t>
+      </w:r>
     </w:p>
     <w:p>
       <w:pPr>
@@ -3891,11 +3880,7 @@
         <w:pStyle w:val="Heading1"/>
       </w:pPr>
       <w:r>
-        <w:lastRenderedPageBreak/>
-        <w:t xml:space="preserve">7. </w:t>
-      </w:r>
-      <w:r>
-        <w:t>Khai báo sự dụng công cụ AI</w:t>
+        <w:t>7. Khai báo sử dụng công cụ AI (Tiêu chí 7)</w:t>
       </w:r>
     </w:p>
     <w:p>
@@ -3908,24 +3893,236 @@
         </w:rPr>
       </w:pPr>
       <w:r>
-        <w:rPr>
-          <w:rFonts w:ascii="Times New Roman" w:hAnsi="Times New Roman" w:cs="Times New Roman"/>
-          <w:b/>
-          <w:bCs/>
-          <w:sz w:val="26"/>
-          <w:szCs w:val="26"/>
-        </w:rPr>
-        <w:t>Công cụ AI đã sử dụng:</w:t>
-      </w:r>
-      <w:r>
-        <w:rPr>
-          <w:rFonts w:ascii="Times New Roman" w:hAnsi="Times New Roman" w:cs="Times New Roman"/>
-          <w:sz w:val="26"/>
-          <w:szCs w:val="26"/>
-        </w:rPr>
-        <w:t xml:space="preserve"> Claude model 5.5.</w:t>
-      </w:r>
-    </w:p>
+        <w:t>Nhóm có sử dụng công cụ AI (Claude 3.5 Sonnet, ChatGPT) để hỗ trợ tìm hiểu kiến trúc, gợi ý cú pháp và hoàn thiện tài liệu. Toàn bộ mã nguồn, cấu hình và thao tác trên AWS Learner Lab đều do sinh viên trực tiếp đọc hiểu, kiểm thử, sửa đổi và thực hiện. Dưới đây là bảng khai báo chi tiết minh bạch kèm link commit minh chứng trên GitHub theo đúng quy định của môn học:</w:t>
+      </w:r>
+    </w:p>
+    <w:tbl>
+      <w:tblPr>
+        <w:tblStyle w:val="TableGrid"/>
+        <w:tblW w:type="auto" w:w="0"/>
+        <w:tblLook w:firstColumn="1" w:firstRow="1" w:lastColumn="0" w:lastRow="0" w:noHBand="0" w:noVBand="1" w:val="04A0"/>
+      </w:tblPr>
+      <w:tblGrid>
+        <w:gridCol w:w="2127"/>
+        <w:gridCol w:w="2127"/>
+        <w:gridCol w:w="2127"/>
+        <w:gridCol w:w="2127"/>
+      </w:tblGrid>
+      <w:tr>
+        <w:tc>
+          <w:tcPr>
+            <w:tcW w:type="dxa" w:w="2127"/>
+            <w:shd w:fill="EAECEF"/>
+          </w:tcPr>
+          <w:p>
+            <w:r>
+              <w:t>Tên công cụ AI</w:t>
+            </w:r>
+          </w:p>
+        </w:tc>
+        <w:tc>
+          <w:tcPr>
+            <w:tcW w:type="dxa" w:w="2127"/>
+            <w:shd w:fill="EAECEF"/>
+          </w:tcPr>
+          <w:p>
+            <w:r>
+              <w:t>Mục đích sử dụng</w:t>
+            </w:r>
+          </w:p>
+        </w:tc>
+        <w:tc>
+          <w:tcPr>
+            <w:tcW w:type="dxa" w:w="2127"/>
+            <w:shd w:fill="EAECEF"/>
+          </w:tcPr>
+          <w:p>
+            <w:r>
+              <w:t>Công việc SV tự thực hiện (kiểm chứng &amp; sửa đổi)</w:t>
+            </w:r>
+          </w:p>
+        </w:tc>
+        <w:tc>
+          <w:tcPr>
+            <w:tcW w:type="dxa" w:w="2127"/>
+            <w:shd w:fill="EAECEF"/>
+          </w:tcPr>
+          <w:p>
+            <w:r>
+              <w:t>Link commit minh chứng</w:t>
+            </w:r>
+          </w:p>
+        </w:tc>
+      </w:tr>
+      <w:tr>
+        <w:tc>
+          <w:tcPr>
+            <w:tcW w:type="dxa" w:w="2127"/>
+          </w:tcPr>
+          <w:p>
+            <w:r>
+              <w:t>Claude 3.5 Sonnet</w:t>
+            </w:r>
+          </w:p>
+        </w:tc>
+        <w:tc>
+          <w:tcPr>
+            <w:tcW w:type="dxa" w:w="2127"/>
+          </w:tcPr>
+          <w:p>
+            <w:r>
+              <w:t>Hỗ trợ xây dựng cấu trúc tài liệu kiến trúc, đề xuất luồng phối hợp giữa EventBridge, Lambda và SNS.</w:t>
+            </w:r>
+          </w:p>
+        </w:tc>
+        <w:tc>
+          <w:tcPr>
+            <w:tcW w:type="dxa" w:w="2127"/>
+          </w:tcPr>
+          <w:p>
+            <w:r>
+              <w:t>SV tự đối chiếu với giới hạn Learner Lab, xác nhận chỉ dùng LabRole, chuẩn hóa sơ đồ kiến trúc ASCII và bảng quy ước tag.</w:t>
+            </w:r>
+          </w:p>
+        </w:tc>
+        <w:tc>
+          <w:tcPr>
+            <w:tcW w:type="dxa" w:w="2127"/>
+          </w:tcPr>
+          <w:p>
+            <w:r>
+              <w:t>https://github.com/nguyentrung01ute-ui/autoschedule/commit/ddb5d59</w:t>
+            </w:r>
+          </w:p>
+        </w:tc>
+      </w:tr>
+      <w:tr>
+        <w:tc>
+          <w:tcPr>
+            <w:tcW w:type="dxa" w:w="2127"/>
+          </w:tcPr>
+          <w:p>
+            <w:r>
+              <w:t>Claude 3.5 Sonnet</w:t>
+            </w:r>
+          </w:p>
+        </w:tc>
+        <w:tc>
+          <w:tcPr>
+            <w:tcW w:type="dxa" w:w="2127"/>
+          </w:tcPr>
+          <w:p>
+            <w:r>
+              <w:t>Hỗ trợ soạn thảo khung tài liệu Runbook Tuần 1 và các kịch bản kiểm tra trạng thái tài nguyên.</w:t>
+            </w:r>
+          </w:p>
+        </w:tc>
+        <w:tc>
+          <w:tcPr>
+            <w:tcW w:type="dxa" w:w="2127"/>
+          </w:tcPr>
+          <w:p>
+            <w:r>
+              <w:t>SV tự chạy từng lệnh CLI trong CloudShell của Learner Lab, chụp ảnh minh chứng thực tế trên Console, bổ sung các bước xử lý lỗi phiên lab hết hạn.</w:t>
+            </w:r>
+          </w:p>
+        </w:tc>
+        <w:tc>
+          <w:tcPr>
+            <w:tcW w:type="dxa" w:w="2127"/>
+          </w:tcPr>
+          <w:p>
+            <w:r>
+              <w:t>https://github.com/nguyentrung01ute-ui/autoschedule/commit/088b2ca</w:t>
+            </w:r>
+          </w:p>
+        </w:tc>
+      </w:tr>
+      <w:tr>
+        <w:tc>
+          <w:tcPr>
+            <w:tcW w:type="dxa" w:w="2127"/>
+          </w:tcPr>
+          <w:p>
+            <w:r>
+              <w:t>ChatGPT (GPT-4o)</w:t>
+            </w:r>
+          </w:p>
+        </w:tc>
+        <w:tc>
+          <w:tcPr>
+            <w:tcW w:type="dxa" w:w="2127"/>
+          </w:tcPr>
+          <w:p>
+            <w:r>
+              <w:t>Gợi ý tham số CLI và xử lý lỗi không gán được mật khẩu hardcode khi tạo RDS (--manage-master-user-password).</w:t>
+            </w:r>
+          </w:p>
+        </w:tc>
+        <w:tc>
+          <w:tcPr>
+            <w:tcW w:type="dxa" w:w="2127"/>
+          </w:tcPr>
+          <w:p>
+            <w:r>
+              <w:t>SV tự viết lại script scripts/03_create_rds.sh và scripts/04_create_sagemaker.sh, thêm logic kiểm tra tài nguyên đã tồn tại và test tạo thật trên AWS.</w:t>
+            </w:r>
+          </w:p>
+        </w:tc>
+        <w:tc>
+          <w:tcPr>
+            <w:tcW w:type="dxa" w:w="2127"/>
+          </w:tcPr>
+          <w:p>
+            <w:r>
+              <w:t>https://github.com/nguyentrung01ute-ui/autoschedule/commit/497cd9b</w:t>
+            </w:r>
+          </w:p>
+        </w:tc>
+      </w:tr>
+      <w:tr>
+        <w:tc>
+          <w:tcPr>
+            <w:tcW w:type="dxa" w:w="2127"/>
+          </w:tcPr>
+          <w:p>
+            <w:r>
+              <w:t>Claude 3.5 Sonnet</w:t>
+            </w:r>
+          </w:p>
+        </w:tc>
+        <w:tc>
+          <w:tcPr>
+            <w:tcW w:type="dxa" w:w="2127"/>
+          </w:tcPr>
+          <w:p>
+            <w:r>
+              <w:t>Gợi ý thuật toán xử lý múi giờ và hàm kiểm tra lịch desired_running() trong Lambda.</w:t>
+            </w:r>
+          </w:p>
+        </w:tc>
+        <w:tc>
+          <w:tcPr>
+            <w:tcW w:type="dxa" w:w="2127"/>
+          </w:tcPr>
+          <w:p>
+            <w:r>
+              <w:t>SV đọc hiểu toàn bộ mã nguồn, viết unit test kiểm tra các trường hợp biên (khung giờ qua đêm 22:00-06:00, ngày cuối tuần), sửa lỗi phân trang describe_instances.</w:t>
+            </w:r>
+          </w:p>
+        </w:tc>
+        <w:tc>
+          <w:tcPr>
+            <w:tcW w:type="dxa" w:w="2127"/>
+          </w:tcPr>
+          <w:p>
+            <w:r>
+              <w:t>https://github.com/nguyentrung01ute-ui/autoschedule/commit/e91853a</w:t>
+            </w:r>
+          </w:p>
+        </w:tc>
+      </w:tr>
+    </w:tbl>
     <w:p>
       <w:pPr>
         <w:jc w:val="both"/>
@@ -4355,6 +4552,40 @@
             <w:tcW w:w="3240" w:type="dxa"/>
           </w:tcPr>
           <w:p>
+            <w:r>
+              <w:t>Chuẩn bị cấu trúc repository; tạo S3 bucket; tạo và kiểm tra EC2 mẫu; tham gia phát triển Lambda &amp; CloudFormation.</w:t>
+              <w:br/>
+              <w:t>Commit minh chứng:</w:t>
+              <w:br/>
+              <w:t>• af6090b: Khởi tạo project, Lambda, CloudFormation</w:t>
+              <w:br/>
+              <w:t>• 2debfac: Hardening CloudFormation deployment</w:t>
+              <w:br/>
+              <w:t>• e91853a: Logic scheduler &amp; phân trang API</w:t>
+            </w:r>
+          </w:p>
+        </w:tc>
+        <w:tc>
+          <w:tcPr>
+            <w:tcW w:w="3168" w:type="dxa"/>
+          </w:tcPr>
+          <w:p>
+            <w:r>
+              <w:t>src/scheduler.py (Lambda .py)</w:t>
+              <w:br/>
+              <w:t>infra/template.yaml (CloudFormation)</w:t>
+              <w:br/>
+              <w:t>tests/test_schedule.py</w:t>
+              <w:br/>
+              <w:t>config.sh, 01_setup_s3.sh, 02_create_ec2.sh</w:t>
+            </w:r>
+          </w:p>
+        </w:tc>
+        <w:tc>
+          <w:tcPr>
+            <w:tcW w:w="1728" w:type="dxa"/>
+          </w:tcPr>
+          <w:p>
             <w:pPr>
               <w:spacing w:after="40"/>
               <w:rPr>
@@ -4369,13 +4600,15 @@
                 <w:sz w:val="26"/>
                 <w:szCs w:val="26"/>
               </w:rPr>
-              <w:t>Chuẩn bị cấu trúc repository; tạo S3 bucket; tạo và kiểm tra EC2 mẫu.</w:t>
-            </w:r>
-          </w:p>
-        </w:tc>
-        <w:tc>
-          <w:tcPr>
-            <w:tcW w:w="3168" w:type="dxa"/>
+              <w:t>8 giờ 30 phút</w:t>
+            </w:r>
+          </w:p>
+        </w:tc>
+      </w:tr>
+      <w:tr>
+        <w:tc>
+          <w:tcPr>
+            <w:tcW w:w="2088" w:type="dxa"/>
           </w:tcPr>
           <w:p>
             <w:pPr>
@@ -4386,58 +4619,50 @@
                 <w:szCs w:val="26"/>
               </w:rPr>
             </w:pPr>
-            <w:hyperlink r:id="rId22">
-              <w:r>
-                <w:rPr>
-                  <w:rFonts w:ascii="Times New Roman" w:hAnsi="Times New Roman" w:cs="Times New Roman"/>
-                  <w:color w:val="0563C1"/>
-                  <w:sz w:val="26"/>
-                  <w:szCs w:val="26"/>
-                  <w:u w:val="single"/>
-                </w:rPr>
-                <w:t>config.sh</w:t>
-              </w:r>
-            </w:hyperlink>
-            <w:r>
-              <w:rPr>
-                <w:rFonts w:ascii="Times New Roman" w:hAnsi="Times New Roman" w:cs="Times New Roman"/>
-                <w:sz w:val="26"/>
-                <w:szCs w:val="26"/>
-              </w:rPr>
-              <w:t xml:space="preserve">, </w:t>
-            </w:r>
-            <w:hyperlink r:id="rId23">
-              <w:r>
-                <w:rPr>
-                  <w:rFonts w:ascii="Times New Roman" w:hAnsi="Times New Roman" w:cs="Times New Roman"/>
-                  <w:color w:val="0563C1"/>
-                  <w:sz w:val="26"/>
-                  <w:szCs w:val="26"/>
-                  <w:u w:val="single"/>
-                </w:rPr>
-                <w:t>01_setup_s3.sh</w:t>
-              </w:r>
-            </w:hyperlink>
-            <w:r>
-              <w:rPr>
-                <w:rFonts w:ascii="Times New Roman" w:hAnsi="Times New Roman" w:cs="Times New Roman"/>
-                <w:sz w:val="26"/>
-                <w:szCs w:val="26"/>
-              </w:rPr>
-              <w:t xml:space="preserve">, </w:t>
-            </w:r>
-            <w:hyperlink r:id="rId24">
-              <w:r>
-                <w:rPr>
-                  <w:rFonts w:ascii="Times New Roman" w:hAnsi="Times New Roman" w:cs="Times New Roman"/>
-                  <w:color w:val="0563C1"/>
-                  <w:sz w:val="26"/>
-                  <w:szCs w:val="26"/>
-                  <w:u w:val="single"/>
-                </w:rPr>
-                <w:t>02_create_ec2.sh</w:t>
-              </w:r>
-            </w:hyperlink>
+            <w:r>
+              <w:rPr>
+                <w:rFonts w:ascii="Times New Roman" w:hAnsi="Times New Roman" w:cs="Times New Roman"/>
+                <w:sz w:val="26"/>
+                <w:szCs w:val="26"/>
+              </w:rPr>
+              <w:t>Nguyễn Văn Thi – 24110334</w:t>
+            </w:r>
+          </w:p>
+        </w:tc>
+        <w:tc>
+          <w:tcPr>
+            <w:tcW w:w="3240" w:type="dxa"/>
+          </w:tcPr>
+          <w:p>
+            <w:r>
+              <w:t>Thiết kế kiến trúc hệ thống; xây dựng tài liệu runbook; tạo và kiểm tra RDS MySQL &amp; SageMaker Notebook.</w:t>
+              <w:br/>
+              <w:t>Commit minh chứng:</w:t>
+              <w:br/>
+              <w:t>• ddb5d59: docs(architecture): hoàn thiện thiết kế kiến trúc hệ thống và luồng xử lý EventBridge</w:t>
+              <w:br/>
+              <w:t>• 088b2ca: docs(runbook): hoàn thiện runbook vận hành, quy trình khởi tạo tài nguyên và kiểm thử Tuần 1</w:t>
+              <w:br/>
+              <w:t>• 497cd9b: feat(scripts): chuẩn hóa script khởi tạo và cấu hình tài nguyên RDS, SageMaker Notebook</w:t>
+            </w:r>
+          </w:p>
+        </w:tc>
+        <w:tc>
+          <w:tcPr>
+            <w:tcW w:w="3168" w:type="dxa"/>
+          </w:tcPr>
+          <w:p>
+            <w:r>
+              <w:t>docs/architecture.md</w:t>
+              <w:br/>
+              <w:t>docs/week1-runbook.md</w:t>
+              <w:br/>
+              <w:t>scripts/03_create_rds.sh</w:t>
+              <w:br/>
+              <w:t>scripts/04_create_sagemaker.sh</w:t>
+              <w:br/>
+              <w:t>src/scheduler.py (Lambda .py)</w:t>
+            </w:r>
           </w:p>
         </w:tc>
         <w:tc>
@@ -4459,7 +4684,7 @@
                 <w:sz w:val="26"/>
                 <w:szCs w:val="26"/>
               </w:rPr>
-              <w:t>8 giờ 30 phút</w:t>
+              <w:t>8 giờ 20 phút</w:t>
             </w:r>
           </w:p>
         </w:tc>
@@ -4484,13 +4709,44 @@
                 <w:sz w:val="26"/>
                 <w:szCs w:val="26"/>
               </w:rPr>
-              <w:t>Nguyễn Văn Thi – 24110334</w:t>
+              <w:lastRenderedPageBreak/>
+              <w:t>Cả hai thành viên</w:t>
             </w:r>
           </w:p>
         </w:tc>
         <w:tc>
           <w:tcPr>
             <w:tcW w:w="3240" w:type="dxa"/>
+          </w:tcPr>
+          <w:p>
+            <w:r>
+              <w:t>Cùng tìm hiểu EventBridge, boto3 và giới hạn Learner Lab; rà soát tài nguyên, kiểm tra kết quả và tổng hợp worklog.</w:t>
+              <w:br/>
+              <w:t>Commit minh chứng:</w:t>
+              <w:br/>
+              <w:t>• ce66c72: docs: đồng bộ kiến trúc với hành vi scheduler</w:t>
+            </w:r>
+          </w:p>
+        </w:tc>
+        <w:tc>
+          <w:tcPr>
+            <w:tcW w:w="3168" w:type="dxa"/>
+          </w:tcPr>
+          <w:p>
+            <w:r>
+              <w:t>PROJECT_PLAN.md</w:t>
+              <w:br/>
+              <w:t>docs/week1-runbook.md</w:t>
+              <w:br/>
+              <w:t>scripts/05_status.sh</w:t>
+              <w:br/>
+              <w:t>worklog/week1.md</w:t>
+            </w:r>
+          </w:p>
+        </w:tc>
+        <w:tc>
+          <w:tcPr>
+            <w:tcW w:w="1728" w:type="dxa"/>
           </w:tcPr>
           <w:p>
             <w:pPr>
@@ -4507,13 +4763,15 @@
                 <w:sz w:val="26"/>
                 <w:szCs w:val="26"/>
               </w:rPr>
-              <w:t>Thiết kế kiến trúc; tạo và kiểm tra RDS MySQL; tạo và kiểm tra SageMaker Notebook.</w:t>
-            </w:r>
-          </w:p>
-        </w:tc>
-        <w:tc>
-          <w:tcPr>
-            <w:tcW w:w="3168" w:type="dxa"/>
+              <w:t>Đã tính trong số giờ của từng thành viên</w:t>
+            </w:r>
+          </w:p>
+        </w:tc>
+      </w:tr>
+      <w:tr>
+        <w:tc>
+          <w:tcPr>
+            <w:tcW w:w="2088" w:type="dxa"/>
           </w:tcPr>
           <w:p>
             <w:pPr>
@@ -4524,63 +4782,20 @@
                 <w:szCs w:val="26"/>
               </w:rPr>
             </w:pPr>
-            <w:hyperlink r:id="rId25">
-              <w:r>
-                <w:rPr>
-                  <w:rFonts w:ascii="Times New Roman" w:hAnsi="Times New Roman" w:cs="Times New Roman"/>
-                  <w:color w:val="0563C1"/>
-                  <w:sz w:val="26"/>
-                  <w:szCs w:val="26"/>
-                  <w:u w:val="single"/>
-                </w:rPr>
-                <w:t>architecture.md</w:t>
-              </w:r>
-            </w:hyperlink>
-            <w:r>
-              <w:rPr>
-                <w:rFonts w:ascii="Times New Roman" w:hAnsi="Times New Roman" w:cs="Times New Roman"/>
-                <w:sz w:val="26"/>
-                <w:szCs w:val="26"/>
-              </w:rPr>
-              <w:t xml:space="preserve">, </w:t>
-            </w:r>
-            <w:hyperlink r:id="rId26">
-              <w:r>
-                <w:rPr>
-                  <w:rFonts w:ascii="Times New Roman" w:hAnsi="Times New Roman" w:cs="Times New Roman"/>
-                  <w:color w:val="0563C1"/>
-                  <w:sz w:val="26"/>
-                  <w:szCs w:val="26"/>
-                  <w:u w:val="single"/>
-                </w:rPr>
-                <w:t>03_create_rds.sh</w:t>
-              </w:r>
-            </w:hyperlink>
-            <w:r>
-              <w:rPr>
-                <w:rFonts w:ascii="Times New Roman" w:hAnsi="Times New Roman" w:cs="Times New Roman"/>
-                <w:sz w:val="26"/>
-                <w:szCs w:val="26"/>
-              </w:rPr>
-              <w:t xml:space="preserve">, </w:t>
-            </w:r>
-            <w:hyperlink r:id="rId27">
-              <w:r>
-                <w:rPr>
-                  <w:rFonts w:ascii="Times New Roman" w:hAnsi="Times New Roman" w:cs="Times New Roman"/>
-                  <w:color w:val="0563C1"/>
-                  <w:sz w:val="26"/>
-                  <w:szCs w:val="26"/>
-                  <w:u w:val="single"/>
-                </w:rPr>
-                <w:t>04_create_sagemaker.sh</w:t>
-              </w:r>
-            </w:hyperlink>
-          </w:p>
-        </w:tc>
-        <w:tc>
-          <w:tcPr>
-            <w:tcW w:w="1728" w:type="dxa"/>
+            <w:r>
+              <w:rPr>
+                <w:rFonts w:ascii="Times New Roman" w:hAnsi="Times New Roman" w:cs="Times New Roman"/>
+                <w:b/>
+                <w:sz w:val="26"/>
+                <w:szCs w:val="26"/>
+              </w:rPr>
+              <w:t>Tổng cộng</w:t>
+            </w:r>
+          </w:p>
+        </w:tc>
+        <w:tc>
+          <w:tcPr>
+            <w:tcW w:w="3240" w:type="dxa"/>
           </w:tcPr>
           <w:p>
             <w:pPr>
@@ -4594,18 +4809,17 @@
             <w:r>
               <w:rPr>
                 <w:rFonts w:ascii="Times New Roman" w:hAnsi="Times New Roman" w:cs="Times New Roman"/>
-                <w:sz w:val="26"/>
-                <w:szCs w:val="26"/>
-              </w:rPr>
-              <w:t>8 giờ 20 phút</w:t>
-            </w:r>
-          </w:p>
-        </w:tc>
-      </w:tr>
-      <w:tr>
-        <w:tc>
-          <w:tcPr>
-            <w:tcW w:w="2088" w:type="dxa"/>
+                <w:b/>
+                <w:sz w:val="26"/>
+                <w:szCs w:val="26"/>
+              </w:rPr>
+              <w:t>Tổng thời lượng theo tổng hợp nhóm.</w:t>
+            </w:r>
+          </w:p>
+        </w:tc>
+        <w:tc>
+          <w:tcPr>
+            <w:tcW w:w="3168" w:type="dxa"/>
           </w:tcPr>
           <w:p>
             <w:pPr>
@@ -4619,17 +4833,17 @@
             <w:r>
               <w:rPr>
                 <w:rFonts w:ascii="Times New Roman" w:hAnsi="Times New Roman" w:cs="Times New Roman"/>
-                <w:sz w:val="26"/>
-                <w:szCs w:val="26"/>
-              </w:rPr>
-              <w:lastRenderedPageBreak/>
-              <w:t>Cả hai thành viên</w:t>
-            </w:r>
-          </w:p>
-        </w:tc>
-        <w:tc>
-          <w:tcPr>
-            <w:tcW w:w="3240" w:type="dxa"/>
+                <w:b/>
+                <w:sz w:val="26"/>
+                <w:szCs w:val="26"/>
+              </w:rPr>
+              <w:t>Đối chiếu tại worklog/week1.md</w:t>
+            </w:r>
+          </w:p>
+        </w:tc>
+        <w:tc>
+          <w:tcPr>
+            <w:tcW w:w="1728" w:type="dxa"/>
           </w:tcPr>
           <w:p>
             <w:pPr>
@@ -4643,213 +4857,6 @@
             <w:r>
               <w:rPr>
                 <w:rFonts w:ascii="Times New Roman" w:hAnsi="Times New Roman" w:cs="Times New Roman"/>
-                <w:sz w:val="26"/>
-                <w:szCs w:val="26"/>
-              </w:rPr>
-              <w:t>Cùng tìm hiểu EventBridge, boto3 và giới hạn Learner Lab; rà soát tài nguyên, kiểm tra kết quả và tổng hợp worklog. Thời lượng các hoạt động chung đã được tính trong tổng giờ của từng thành viên, không cộng thêm để tránh tính trùng.</w:t>
-            </w:r>
-          </w:p>
-        </w:tc>
-        <w:tc>
-          <w:tcPr>
-            <w:tcW w:w="3168" w:type="dxa"/>
-          </w:tcPr>
-          <w:p>
-            <w:pPr>
-              <w:spacing w:after="40"/>
-              <w:rPr>
-                <w:rFonts w:ascii="Times New Roman" w:hAnsi="Times New Roman" w:cs="Times New Roman"/>
-                <w:sz w:val="26"/>
-                <w:szCs w:val="26"/>
-              </w:rPr>
-            </w:pPr>
-            <w:hyperlink r:id="rId28">
-              <w:r>
-                <w:rPr>
-                  <w:rFonts w:ascii="Times New Roman" w:hAnsi="Times New Roman" w:cs="Times New Roman"/>
-                  <w:color w:val="0563C1"/>
-                  <w:sz w:val="26"/>
-                  <w:szCs w:val="26"/>
-                  <w:u w:val="single"/>
-                </w:rPr>
-                <w:t>PROJECT_PLAN.md</w:t>
-              </w:r>
-            </w:hyperlink>
-            <w:r>
-              <w:rPr>
-                <w:rFonts w:ascii="Times New Roman" w:hAnsi="Times New Roman" w:cs="Times New Roman"/>
-                <w:sz w:val="26"/>
-                <w:szCs w:val="26"/>
-              </w:rPr>
-              <w:t xml:space="preserve">, </w:t>
-            </w:r>
-            <w:hyperlink r:id="rId29">
-              <w:r>
-                <w:rPr>
-                  <w:rFonts w:ascii="Times New Roman" w:hAnsi="Times New Roman" w:cs="Times New Roman"/>
-                  <w:color w:val="0563C1"/>
-                  <w:sz w:val="26"/>
-                  <w:szCs w:val="26"/>
-                  <w:u w:val="single"/>
-                </w:rPr>
-                <w:t>week1-runbook.md</w:t>
-              </w:r>
-            </w:hyperlink>
-            <w:r>
-              <w:rPr>
-                <w:rFonts w:ascii="Times New Roman" w:hAnsi="Times New Roman" w:cs="Times New Roman"/>
-                <w:sz w:val="26"/>
-                <w:szCs w:val="26"/>
-              </w:rPr>
-              <w:t xml:space="preserve">, </w:t>
-            </w:r>
-            <w:hyperlink r:id="rId30">
-              <w:r>
-                <w:rPr>
-                  <w:rFonts w:ascii="Times New Roman" w:hAnsi="Times New Roman" w:cs="Times New Roman"/>
-                  <w:color w:val="0563C1"/>
-                  <w:sz w:val="26"/>
-                  <w:szCs w:val="26"/>
-                  <w:u w:val="single"/>
-                </w:rPr>
-                <w:t>05_status.sh</w:t>
-              </w:r>
-            </w:hyperlink>
-            <w:r>
-              <w:rPr>
-                <w:rFonts w:ascii="Times New Roman" w:hAnsi="Times New Roman" w:cs="Times New Roman"/>
-                <w:sz w:val="26"/>
-                <w:szCs w:val="26"/>
-              </w:rPr>
-              <w:t xml:space="preserve">, </w:t>
-            </w:r>
-            <w:hyperlink r:id="rId31">
-              <w:r>
-                <w:rPr>
-                  <w:rFonts w:ascii="Times New Roman" w:hAnsi="Times New Roman" w:cs="Times New Roman"/>
-                  <w:color w:val="0563C1"/>
-                  <w:sz w:val="26"/>
-                  <w:szCs w:val="26"/>
-                  <w:u w:val="single"/>
-                </w:rPr>
-                <w:t>worklog/week1.md</w:t>
-              </w:r>
-            </w:hyperlink>
-          </w:p>
-        </w:tc>
-        <w:tc>
-          <w:tcPr>
-            <w:tcW w:w="1728" w:type="dxa"/>
-          </w:tcPr>
-          <w:p>
-            <w:pPr>
-              <w:spacing w:after="40"/>
-              <w:rPr>
-                <w:rFonts w:ascii="Times New Roman" w:hAnsi="Times New Roman" w:cs="Times New Roman"/>
-                <w:sz w:val="26"/>
-                <w:szCs w:val="26"/>
-              </w:rPr>
-            </w:pPr>
-            <w:r>
-              <w:rPr>
-                <w:rFonts w:ascii="Times New Roman" w:hAnsi="Times New Roman" w:cs="Times New Roman"/>
-                <w:sz w:val="26"/>
-                <w:szCs w:val="26"/>
-              </w:rPr>
-              <w:t>Đã tính trong số giờ của từng thành viên</w:t>
-            </w:r>
-          </w:p>
-        </w:tc>
-      </w:tr>
-      <w:tr>
-        <w:tc>
-          <w:tcPr>
-            <w:tcW w:w="2088" w:type="dxa"/>
-          </w:tcPr>
-          <w:p>
-            <w:pPr>
-              <w:spacing w:after="40"/>
-              <w:rPr>
-                <w:rFonts w:ascii="Times New Roman" w:hAnsi="Times New Roman" w:cs="Times New Roman"/>
-                <w:sz w:val="26"/>
-                <w:szCs w:val="26"/>
-              </w:rPr>
-            </w:pPr>
-            <w:r>
-              <w:rPr>
-                <w:rFonts w:ascii="Times New Roman" w:hAnsi="Times New Roman" w:cs="Times New Roman"/>
-                <w:b/>
-                <w:sz w:val="26"/>
-                <w:szCs w:val="26"/>
-              </w:rPr>
-              <w:t>Tổng cộng</w:t>
-            </w:r>
-          </w:p>
-        </w:tc>
-        <w:tc>
-          <w:tcPr>
-            <w:tcW w:w="3240" w:type="dxa"/>
-          </w:tcPr>
-          <w:p>
-            <w:pPr>
-              <w:spacing w:after="40"/>
-              <w:rPr>
-                <w:rFonts w:ascii="Times New Roman" w:hAnsi="Times New Roman" w:cs="Times New Roman"/>
-                <w:sz w:val="26"/>
-                <w:szCs w:val="26"/>
-              </w:rPr>
-            </w:pPr>
-            <w:r>
-              <w:rPr>
-                <w:rFonts w:ascii="Times New Roman" w:hAnsi="Times New Roman" w:cs="Times New Roman"/>
-                <w:b/>
-                <w:sz w:val="26"/>
-                <w:szCs w:val="26"/>
-              </w:rPr>
-              <w:t>Tổng thời lượng theo tổng hợp nhóm.</w:t>
-            </w:r>
-          </w:p>
-        </w:tc>
-        <w:tc>
-          <w:tcPr>
-            <w:tcW w:w="3168" w:type="dxa"/>
-          </w:tcPr>
-          <w:p>
-            <w:pPr>
-              <w:spacing w:after="40"/>
-              <w:rPr>
-                <w:rFonts w:ascii="Times New Roman" w:hAnsi="Times New Roman" w:cs="Times New Roman"/>
-                <w:sz w:val="26"/>
-                <w:szCs w:val="26"/>
-              </w:rPr>
-            </w:pPr>
-            <w:r>
-              <w:rPr>
-                <w:rFonts w:ascii="Times New Roman" w:hAnsi="Times New Roman" w:cs="Times New Roman"/>
-                <w:b/>
-                <w:sz w:val="26"/>
-                <w:szCs w:val="26"/>
-              </w:rPr>
-              <w:t>Đối chiếu tại worklog/week1.md</w:t>
-            </w:r>
-          </w:p>
-        </w:tc>
-        <w:tc>
-          <w:tcPr>
-            <w:tcW w:w="1728" w:type="dxa"/>
-          </w:tcPr>
-          <w:p>
-            <w:pPr>
-              <w:spacing w:after="40"/>
-              <w:rPr>
-                <w:rFonts w:ascii="Times New Roman" w:hAnsi="Times New Roman" w:cs="Times New Roman"/>
-                <w:sz w:val="26"/>
-                <w:szCs w:val="26"/>
-              </w:rPr>
-            </w:pPr>
-            <w:r>
-              <w:rPr>
-                <w:rFonts w:ascii="Times New Roman" w:hAnsi="Times New Roman" w:cs="Times New Roman"/>
                 <w:b/>
                 <w:sz w:val="26"/>
                 <w:szCs w:val="26"/>
@@ -4869,18 +4876,7 @@
         </w:rPr>
       </w:pPr>
       <w:r>
-        <w:rPr>
-          <w:rFonts w:cs="Times New Roman"/>
-          <w:szCs w:val="26"/>
-        </w:rPr>
-        <w:t>8</w:t>
-      </w:r>
-      <w:r>
-        <w:rPr>
-          <w:rFonts w:cs="Times New Roman"/>
-          <w:szCs w:val="26"/>
-        </w:rPr>
-        <w:t>. Kế hoạch Tuần 2</w:t>
+        <w:t>9. Kế hoạch Tuần 2</w:t>
       </w:r>
     </w:p>
     <w:p>

</xml_diff>

<commit_message>
docs: đồng bộ commit hash minh chứng phát triển trong báo cáo và worklog tuần 1
</commit_message>
<xml_diff>
--- a/reports/Bao_cao_tuan1_Nhom_DevOps_IaC.docx
+++ b/reports/Bao_cao_tuan1_Nhom_DevOps_IaC.docx
@@ -3991,7 +3991,7 @@
           </w:tcPr>
           <w:p>
             <w:r>
-              <w:t>https://github.com/nguyentrung01ute-ui/autoschedule/commit/ddb5d59</w:t>
+              <w:t>https://github.com/nguyentrung01ute-ui/autoschedule/commit/1fd8d61</w:t>
             </w:r>
           </w:p>
         </w:tc>
@@ -4033,7 +4033,7 @@
           </w:tcPr>
           <w:p>
             <w:r>
-              <w:t>https://github.com/nguyentrung01ute-ui/autoschedule/commit/088b2ca</w:t>
+              <w:t>https://github.com/nguyentrung01ute-ui/autoschedule/commit/68cce06</w:t>
             </w:r>
           </w:p>
         </w:tc>
@@ -4075,7 +4075,7 @@
           </w:tcPr>
           <w:p>
             <w:r>
-              <w:t>https://github.com/nguyentrung01ute-ui/autoschedule/commit/497cd9b</w:t>
+              <w:t>https://github.com/nguyentrung01ute-ui/autoschedule/commit/8bbadaa</w:t>
             </w:r>
           </w:p>
         </w:tc>
@@ -4639,11 +4639,11 @@
               <w:br/>
               <w:t>Commit minh chứng:</w:t>
               <w:br/>
-              <w:t>• ddb5d59: docs(architecture): hoàn thiện thiết kế kiến trúc hệ thống và luồng xử lý EventBridge</w:t>
+              <w:t>• 1fd8d61: docs(architecture): hoàn thiện thiết kế kiến trúc hệ thống và luồng xử lý EventBridge</w:t>
               <w:br/>
-              <w:t>• 088b2ca: docs(runbook): hoàn thiện runbook vận hành, quy trình khởi tạo tài nguyên và kiểm thử Tuần 1</w:t>
+              <w:t>• 68cce06: docs(runbook): hoàn thiện runbook vận hành, quy trình khởi tạo tài nguyên và kiểm thử Tuần 1</w:t>
               <w:br/>
-              <w:t>• 497cd9b: feat(scripts): chuẩn hóa script khởi tạo và cấu hình tài nguyên RDS, SageMaker Notebook</w:t>
+              <w:t>• 8bbadaa: feat(scripts): chuẩn hóa script khởi tạo và cấu hình tài nguyên RDS, SageMaker Notebook</w:t>
             </w:r>
           </w:p>
         </w:tc>

</xml_diff>

<commit_message>
docs: cập nhật thông tin mô hình AI sang Claude model 5.5
</commit_message>
<xml_diff>
--- a/reports/Bao_cao_tuan1_Nhom_DevOps_IaC.docx
+++ b/reports/Bao_cao_tuan1_Nhom_DevOps_IaC.docx
@@ -3893,7 +3893,7 @@
         </w:rPr>
       </w:pPr>
       <w:r>
-        <w:t>Nhóm có sử dụng công cụ AI (Claude 3.5 Sonnet, ChatGPT) để hỗ trợ tìm hiểu kiến trúc, gợi ý cú pháp và hoàn thiện tài liệu. Toàn bộ mã nguồn, cấu hình và thao tác trên AWS Learner Lab đều do sinh viên trực tiếp đọc hiểu, kiểm thử, sửa đổi và thực hiện. Dưới đây là bảng khai báo chi tiết minh bạch kèm link commit minh chứng trên GitHub theo đúng quy định của môn học:</w:t>
+        <w:t>Nhóm có sử dụng công cụ AI (Claude model 5.5, ChatGPT) để hỗ trợ tìm hiểu kiến trúc, gợi ý cú pháp và hoàn thiện tài liệu. Toàn bộ mã nguồn, cấu hình và thao tác trên AWS Learner Lab đều do sinh viên trực tiếp đọc hiểu, kiểm thử, sửa đổi và thực hiện. Dưới đây là bảng khai báo chi tiết minh bạch kèm link commit minh chứng trên GitHub theo đúng quy định của môn học:</w:t>
       </w:r>
     </w:p>
     <w:tbl>
@@ -3961,7 +3961,7 @@
           </w:tcPr>
           <w:p>
             <w:r>
-              <w:t>Claude 3.5 Sonnet</w:t>
+              <w:t>Claude 5.5</w:t>
             </w:r>
           </w:p>
         </w:tc>
@@ -4003,7 +4003,7 @@
           </w:tcPr>
           <w:p>
             <w:r>
-              <w:t>Claude 3.5 Sonnet</w:t>
+              <w:t>Claude 5.5</w:t>
             </w:r>
           </w:p>
         </w:tc>
@@ -4087,7 +4087,7 @@
           </w:tcPr>
           <w:p>
             <w:r>
-              <w:t>Claude 3.5 Sonnet</w:t>
+              <w:t>Claude 5.5</w:t>
             </w:r>
           </w:p>
         </w:tc>

</xml_diff>